<commit_message>
Separate combining, regression, and automation lectures
</commit_message>
<xml_diff>
--- a/Introduction-to-Stata-Syllabus.docx
+++ b/Introduction-to-Stata-Syllabus.docx
@@ -612,7 +612,7 @@
           <w:color w:val="0B2545"/>
           <w:sz w:val="22"/>
         </w:rPr>
-        <w:t xml:space="preserve"> This course introduces Stata as a reproducible research environment. Students learn to organize a project, write and run do-files, import and validate data, clean and transform variables, combine and reshape datasets, automate repeated tasks, produce descriptive output and graphics, and carry out a descriptive analysis. The five teaching sessions contribute to one complete workflow that can be rerun from raw data. The sixth meeting is the final in-class exam.</w:t>
+        <w:t xml:space="preserve"> This course introduces Stata as a reproducible research environment. Students learn to organize a project, write and run do-files, import and validate data, clean and transform variables, combine datasets, run and interpret regressions, automate repeated regressions, and interpret descriptive and regression output. Reshaping is an optional extension. The five teaching sessions contribute to one complete workflow that can be rerun from raw data. The sixth meeting is the final in-class exam.</w:t>
       </w:r>
     </w:p>
     <w:p>
@@ -926,7 +926,7 @@
           <w:color w:val="0B2545"/>
           <w:sz w:val="22"/>
         </w:rPr>
-        <w:t>Append, merge, reshape, and aggregate data while checking that the resulting unit of observation is correct.</w:t>
+        <w:t>Append and merge data while checking keys, match results, and the resulting unit of observation.</w:t>
       </w:r>
     </w:p>
     <w:p>
@@ -943,7 +943,7 @@
           <w:color w:val="0B2545"/>
           <w:sz w:val="22"/>
         </w:rPr>
-        <w:t>Automate repeated work with local macros, loops, conditions, and a small reusable Stata program.</w:t>
+        <w:t>Run simple and multiple regressions, use categorical controls and log outcomes, and interpret coefficients and sample sizes as descriptive associations.</w:t>
       </w:r>
     </w:p>
     <w:p>
@@ -960,7 +960,24 @@
           <w:color w:val="0B2545"/>
           <w:sz w:val="22"/>
         </w:rPr>
-        <w:t>Produce descriptive tables and purposeful graphics and export them reproducibly.</w:t>
+        <w:t>Automate repeated regressions with local macros and loops, and verify an iteration against a manually specified regression.</w:t>
+      </w:r>
+    </w:p>
+    <w:p>
+      <w:pPr>
+        <w:numPr>
+          <w:ilvl w:val="0"/>
+          <w:numId w:val="10"/>
+        </w:numPr>
+        <w:spacing w:before="0" w:after="160" w:line="280" w:lineRule="auto"/>
+      </w:pPr>
+      <w:r>
+        <w:rPr>
+          <w:rFonts w:ascii="Calibri" w:hAnsi="Calibri" w:eastAsia="Calibri"/>
+          <w:color w:val="0B2545"/>
+          <w:sz w:val="22"/>
+        </w:rPr>
+        <w:t>Read descriptive summaries and regression output and record results reproducibly.</w:t>
       </w:r>
     </w:p>
     <w:p>
@@ -990,7 +1007,7 @@
           <w:color w:val="0B2545"/>
           <w:sz w:val="22"/>
         </w:rPr>
-        <w:t>Supplementary materials introduce regression, adjusted predictions, and resampling. These are available for further study and are outside the exam scope for the five-session teaching plan.</w:t>
+        <w:t>Optional materials cover reshaping, custom programs, additional graphics, adjusted predictions, and resampling. These extensions are outside the exam scope. Basic regression is part of the core teaching sequence, before programming.</w:t>
       </w:r>
     </w:p>
     <w:p>
@@ -1077,7 +1094,7 @@
           <w:color w:val="0B2545"/>
           <w:sz w:val="22"/>
         </w:rPr>
-        <w:t>Session 1's exercise is ungraded practice. In Sessions 2–5, students submit an individual, reproducible exercise attempt as the graded checkpoint. There is no checkpoint in the exam meeting.</w:t>
+        <w:t>Session 1's exercise is ungraded practice. Four individual, reproducible exercise attempts form the graded checkpoints during the teaching meetings. Checkpoint identifiers and weights are retained. The revised checkpoints cover cleaning, combining, regression, and regression automation. Submission details and any make-up arrangements are announced in class. There is no checkpoint in the exam meeting.</w:t>
       </w:r>
     </w:p>
     <w:p>
@@ -1377,7 +1394,7 @@
                 <w:color w:val="0B2545"/>
                 <w:sz w:val="20"/>
               </w:rPr>
-              <w:t>Four short individual do-files in Sessions 2–5, each worth 10% of the total course score. Assessed for a reasonable, reproducible attempt.</w:t>
+              <w:t>Four short individual do-files during the teaching meetings, each worth 10% of the total course score. Assessed for a reasonable, reproducible attempt.</w:t>
             </w:r>
           </w:p>
         </w:tc>
@@ -1482,7 +1499,7 @@
                 <w:color w:val="0B2545"/>
                 <w:sz w:val="20"/>
               </w:rPr>
-              <w:t>Individual exam in Session 6 on 19 October, covering the material taught in Sessions 1–5.</w:t>
+              <w:t>Individual exam in Session 6 on 19 October, 08:50–10:30, covering the material taught in the five teaching meetings.</w:t>
             </w:r>
           </w:p>
         </w:tc>
@@ -1654,7 +1671,7 @@
           <w:color w:val="0B2545"/>
           <w:sz w:val="22"/>
         </w:rPr>
-        <w:t>The individual final exam takes place during Session 6 on 19 October 2026. It assesses the Stata concepts and reproducible workflow taught in Sessions 1–5. There is no new lecture or separate checkpoint in this meeting.</w:t>
+        <w:t>The individual final exam takes place during Session 6 on Monday, 19 October 2026, 08:50–10:30. This is the original scheduled exam slot and is unchanged. It assesses the Stata concepts and reproducible workflow taught in the five teaching meetings. There is no new lecture or separate checkpoint in this meeting.</w:t>
       </w:r>
     </w:p>
     <w:p>
@@ -1758,6 +1775,70 @@
     </w:p>
     <w:p>
       <w:pPr>
+        <w:widowControl/>
+      </w:pPr>
+      <w:r>
+        <w:rPr>
+          <w:rFonts w:ascii="Calibri" w:hAnsi="Calibri" w:eastAsia="Calibri"/>
+          <w:color w:val="0B2545"/>
+          <w:sz w:val="22"/>
+        </w:rPr>
+        <w:t xml:space="preserve">Lectures 1 and 2 and their exercises remain unchanged. The revised sequence keeps three separate lecture files: </w:t>
+      </w:r>
+      <w:r>
+        <w:rPr>
+          <w:rFonts w:ascii="Calibri" w:hAnsi="Calibri" w:eastAsia="Calibri"/>
+          <w:b/>
+          <w:color w:val="0B2545"/>
+          <w:sz w:val="22"/>
+        </w:rPr>
+        <w:t>combining data</w:t>
+      </w:r>
+      <w:r>
+        <w:rPr>
+          <w:rFonts w:ascii="Calibri" w:hAnsi="Calibri" w:eastAsia="Calibri"/>
+          <w:color w:val="0B2545"/>
+          <w:sz w:val="22"/>
+        </w:rPr>
+        <w:t xml:space="preserve">, </w:t>
+      </w:r>
+      <w:r>
+        <w:rPr>
+          <w:rFonts w:ascii="Calibri" w:hAnsi="Calibri" w:eastAsia="Calibri"/>
+          <w:b/>
+          <w:color w:val="0B2545"/>
+          <w:sz w:val="22"/>
+        </w:rPr>
+        <w:t>running and interpreting regressions</w:t>
+      </w:r>
+      <w:r>
+        <w:rPr>
+          <w:rFonts w:ascii="Calibri" w:hAnsi="Calibri" w:eastAsia="Calibri"/>
+          <w:color w:val="0B2545"/>
+          <w:sz w:val="22"/>
+        </w:rPr>
+        <w:t xml:space="preserve">, and </w:t>
+      </w:r>
+      <w:r>
+        <w:rPr>
+          <w:rFonts w:ascii="Calibri" w:hAnsi="Calibri" w:eastAsia="Calibri"/>
+          <w:b/>
+          <w:color w:val="0B2545"/>
+          <w:sz w:val="22"/>
+        </w:rPr>
+        <w:t>automating regressions</w:t>
+      </w:r>
+      <w:r>
+        <w:rPr>
+          <w:rFonts w:ascii="Calibri" w:hAnsi="Calibri" w:eastAsia="Calibri"/>
+          <w:color w:val="0B2545"/>
+          <w:sz w:val="22"/>
+        </w:rPr>
+        <w:t>. Lecture-folder names are retained for stable links; their numbers identify material rather than separate remaining dates.</w:t>
+      </w:r>
+    </w:p>
+    <w:p>
+      <w:pPr>
         <w:pStyle w:val="Heading2"/>
       </w:pPr>
       <w:r>
@@ -1766,7 +1847,7 @@
           <w:color w:val="0B2545"/>
           <w:sz w:val="22"/>
         </w:rPr>
-        <w:t>Session 1 — 14 September · Stata workflow</w:t>
+        <w:t>Workflow and cleaning foundations</w:t>
       </w:r>
     </w:p>
     <w:p>
@@ -1783,7 +1864,7 @@
           <w:color w:val="0B2545"/>
           <w:sz w:val="22"/>
         </w:rPr>
-        <w:t>Stata's data, command, results, and do-file workflow.</w:t>
+        <w:t>Stata's data, command, results, and do-file workflow; relative paths and logs.</w:t>
       </w:r>
     </w:p>
     <w:p>
@@ -1800,7 +1881,7 @@
           <w:color w:val="0B2545"/>
           <w:sz w:val="22"/>
         </w:rPr>
-        <w:t>Repository structure, relative paths, logs, and generated output.</w:t>
+        <w:t>Importing, inspecting, and saving data; candidate keys and duplicate reports.</w:t>
       </w:r>
     </w:p>
     <w:p>
@@ -1817,7 +1898,24 @@
           <w:color w:val="0B2545"/>
           <w:sz w:val="22"/>
         </w:rPr>
-        <w:t xml:space="preserve">Importing a CSV; </w:t>
+        <w:t>Parsing strings, numeric conversion, missing values, labels, units, and assertions.</w:t>
+      </w:r>
+    </w:p>
+    <w:p>
+      <w:pPr>
+        <w:numPr>
+          <w:ilvl w:val="0"/>
+          <w:numId w:val="10"/>
+        </w:numPr>
+        <w:spacing w:before="0" w:after="160" w:line="280" w:lineRule="auto"/>
+      </w:pPr>
+      <w:r>
+        <w:rPr>
+          <w:rFonts w:ascii="Calibri" w:hAnsi="Calibri" w:eastAsia="Calibri"/>
+          <w:color w:val="0B2545"/>
+          <w:sz w:val="22"/>
+        </w:rPr>
+        <w:t xml:space="preserve">Materials: </w:t>
       </w:r>
       <w:r>
         <w:rPr>
@@ -1825,7 +1923,7 @@
           <w:color w:val="1F4D78"/>
           <w:sz w:val="19"/>
         </w:rPr>
-        <w:t>describe</w:t>
+        <w:t>session-01-stata-workflow</w:t>
       </w:r>
       <w:r>
         <w:rPr>
@@ -1833,7 +1931,7 @@
           <w:color w:val="0B2545"/>
           <w:sz w:val="22"/>
         </w:rPr>
-        <w:t xml:space="preserve">, </w:t>
+        <w:t xml:space="preserve"> and </w:t>
       </w:r>
       <w:r>
         <w:rPr>
@@ -1841,55 +1939,7 @@
           <w:color w:val="1F4D78"/>
           <w:sz w:val="19"/>
         </w:rPr>
-        <w:t>codebook</w:t>
-      </w:r>
-      <w:r>
-        <w:rPr>
-          <w:rFonts w:ascii="Calibri" w:hAnsi="Calibri" w:eastAsia="Calibri"/>
-          <w:color w:val="0B2545"/>
-          <w:sz w:val="22"/>
-        </w:rPr>
-        <w:t xml:space="preserve">, </w:t>
-      </w:r>
-      <w:r>
-        <w:rPr>
-          <w:rFonts w:ascii="Consolas" w:hAnsi="Consolas" w:eastAsia="Consolas"/>
-          <w:color w:val="1F4D78"/>
-          <w:sz w:val="19"/>
-        </w:rPr>
-        <w:t>summarize</w:t>
-      </w:r>
-      <w:r>
-        <w:rPr>
-          <w:rFonts w:ascii="Calibri" w:hAnsi="Calibri" w:eastAsia="Calibri"/>
-          <w:color w:val="0B2545"/>
-          <w:sz w:val="22"/>
-        </w:rPr>
-        <w:t xml:space="preserve">, </w:t>
-      </w:r>
-      <w:r>
-        <w:rPr>
-          <w:rFonts w:ascii="Consolas" w:hAnsi="Consolas" w:eastAsia="Consolas"/>
-          <w:color w:val="1F4D78"/>
-          <w:sz w:val="19"/>
-        </w:rPr>
-        <w:t>tabulate</w:t>
-      </w:r>
-      <w:r>
-        <w:rPr>
-          <w:rFonts w:ascii="Calibri" w:hAnsi="Calibri" w:eastAsia="Calibri"/>
-          <w:color w:val="0B2545"/>
-          <w:sz w:val="22"/>
-        </w:rPr>
-        <w:t xml:space="preserve">, and </w:t>
-      </w:r>
-      <w:r>
-        <w:rPr>
-          <w:rFonts w:ascii="Consolas" w:hAnsi="Consolas" w:eastAsia="Consolas"/>
-          <w:color w:val="1F4D78"/>
-          <w:sz w:val="19"/>
-        </w:rPr>
-        <w:t>list</w:t>
+        <w:t>session-02-cleaning-transforming</w:t>
       </w:r>
       <w:r>
         <w:rPr>
@@ -1914,23 +1964,20 @@
           <w:color w:val="0B2545"/>
           <w:sz w:val="22"/>
         </w:rPr>
-        <w:t xml:space="preserve">Candidate keys, duplicate reports, labels, compression, and saving </w:t>
+        <w:t>Workflow exercise: ungraded. Cleaning exercise: checkpoint 1 (10%).</w:t>
       </w:r>
-      <w:r>
-        <w:rPr>
-          <w:rFonts w:ascii="Consolas" w:hAnsi="Consolas" w:eastAsia="Consolas"/>
-          <w:color w:val="1F4D78"/>
-          <w:sz w:val="19"/>
-        </w:rPr>
-        <w:t>.dta</w:t>
-      </w:r>
+    </w:p>
+    <w:p>
+      <w:pPr>
+        <w:pStyle w:val="Heading2"/>
+      </w:pPr>
       <w:r>
         <w:rPr>
           <w:rFonts w:ascii="Calibri" w:hAnsi="Calibri" w:eastAsia="Calibri"/>
           <w:color w:val="0B2545"/>
           <w:sz w:val="22"/>
         </w:rPr>
-        <w:t xml:space="preserve"> files.</w:t>
+        <w:t>Lecture 3 Combining data</w:t>
       </w:r>
     </w:p>
     <w:p>
@@ -1947,36 +1994,7 @@
           <w:color w:val="0B2545"/>
           <w:sz w:val="22"/>
         </w:rPr>
-        <w:t xml:space="preserve">Ungraded practice: load the saved </w:t>
-      </w:r>
-      <w:r>
-        <w:rPr>
-          <w:rFonts w:ascii="Consolas" w:hAnsi="Consolas" w:eastAsia="Consolas"/>
-          <w:color w:val="1F4D78"/>
-          <w:sz w:val="19"/>
-        </w:rPr>
-        <w:t>.dta</w:t>
-      </w:r>
-      <w:r>
-        <w:rPr>
-          <w:rFonts w:ascii="Calibri" w:hAnsi="Calibri" w:eastAsia="Calibri"/>
-          <w:color w:val="0B2545"/>
-          <w:sz w:val="22"/>
-        </w:rPr>
-        <w:t xml:space="preserve"> file, inspect different fields, and compare star-category subsamples.</w:t>
-      </w:r>
-    </w:p>
-    <w:p>
-      <w:pPr>
-        <w:pStyle w:val="Heading2"/>
-      </w:pPr>
-      <w:r>
-        <w:rPr>
-          <w:rFonts w:ascii="Calibri" w:hAnsi="Calibri" w:eastAsia="Calibri"/>
-          <w:color w:val="0B2545"/>
-          <w:sz w:val="22"/>
-        </w:rPr>
-        <w:t>Session 2 — 21 September · Cleaning and transforming</w:t>
+        <w:t>Taught on 5 October, before the separate regression lecture.</w:t>
       </w:r>
     </w:p>
     <w:p>
@@ -1993,7 +2011,7 @@
           <w:color w:val="0B2545"/>
           <w:sz w:val="22"/>
         </w:rPr>
-        <w:t>Diagnosing missingness, duplicate hotel records, and inconsistent strings.</w:t>
+        <w:t>Distinguish hotel attributes from repeated price quotes; identify keys.</w:t>
       </w:r>
     </w:p>
     <w:p>
@@ -2010,122 +2028,7 @@
           <w:color w:val="0B2545"/>
           <w:sz w:val="22"/>
         </w:rPr>
-        <w:t>Parsing distances, guest ratings, accommodation types, and night counts.</w:t>
-      </w:r>
-    </w:p>
-    <w:p>
-      <w:pPr>
-        <w:numPr>
-          <w:ilvl w:val="0"/>
-          <w:numId w:val="10"/>
-        </w:numPr>
-        <w:spacing w:before="0" w:after="160" w:line="280" w:lineRule="auto"/>
-      </w:pPr>
-      <w:r>
-        <w:rPr>
-          <w:rFonts w:ascii="Calibri" w:hAnsi="Calibri" w:eastAsia="Calibri"/>
-          <w:color w:val="0B2545"/>
-          <w:sz w:val="22"/>
-        </w:rPr>
-        <w:t>Numeric conversion, missing-value decisions, labels, and units.</w:t>
-      </w:r>
-    </w:p>
-    <w:p>
-      <w:pPr>
-        <w:numPr>
-          <w:ilvl w:val="0"/>
-          <w:numId w:val="10"/>
-        </w:numPr>
-        <w:spacing w:before="0" w:after="160" w:line="280" w:lineRule="auto"/>
-      </w:pPr>
-      <w:r>
-        <w:rPr>
-          <w:rFonts w:ascii="Calibri" w:hAnsi="Calibri" w:eastAsia="Calibri"/>
-          <w:color w:val="0B2545"/>
-          <w:sz w:val="22"/>
-        </w:rPr>
-        <w:t>Assertions as executable documentation of data expectations.</w:t>
-      </w:r>
-    </w:p>
-    <w:p>
-      <w:pPr>
-        <w:numPr>
-          <w:ilvl w:val="0"/>
-          <w:numId w:val="10"/>
-        </w:numPr>
-        <w:spacing w:before="0" w:after="160" w:line="280" w:lineRule="auto"/>
-      </w:pPr>
-      <w:r>
-        <w:rPr>
-          <w:rFonts w:ascii="Calibri" w:hAnsi="Calibri" w:eastAsia="Calibri"/>
-          <w:color w:val="0B2545"/>
-          <w:sz w:val="22"/>
-        </w:rPr>
-        <w:t>Checkpoint 1 (10%): clean alternative distance/rating fields, convert units, and validate hotel records.</w:t>
-      </w:r>
-    </w:p>
-    <w:p>
-      <w:pPr>
-        <w:pStyle w:val="Heading2"/>
-      </w:pPr>
-      <w:r>
-        <w:rPr>
-          <w:rFonts w:ascii="Calibri" w:hAnsi="Calibri" w:eastAsia="Calibri"/>
-          <w:color w:val="0B2545"/>
-          <w:sz w:val="22"/>
-        </w:rPr>
-        <w:t>Session 3 — 28 September · Combining and reshaping</w:t>
-      </w:r>
-    </w:p>
-    <w:p>
-      <w:pPr>
-        <w:numPr>
-          <w:ilvl w:val="0"/>
-          <w:numId w:val="10"/>
-        </w:numPr>
-        <w:spacing w:before="0" w:after="160" w:line="280" w:lineRule="auto"/>
-      </w:pPr>
-      <w:r>
-        <w:rPr>
-          <w:rFonts w:ascii="Calibri" w:hAnsi="Calibri" w:eastAsia="Calibri"/>
-          <w:color w:val="0B2545"/>
-          <w:sz w:val="22"/>
-        </w:rPr>
-        <w:t>Unit of observation and key structure.</w:t>
-      </w:r>
-    </w:p>
-    <w:p>
-      <w:pPr>
-        <w:numPr>
-          <w:ilvl w:val="0"/>
-          <w:numId w:val="10"/>
-        </w:numPr>
-        <w:spacing w:before="0" w:after="160" w:line="280" w:lineRule="auto"/>
-      </w:pPr>
-      <w:r>
-        <w:rPr>
-          <w:rFonts w:ascii="Calibri" w:hAnsi="Calibri" w:eastAsia="Calibri"/>
-          <w:color w:val="0B2545"/>
-          <w:sz w:val="22"/>
-        </w:rPr>
-        <w:t>Appending annual hotel-price extracts and validating stacked records.</w:t>
-      </w:r>
-    </w:p>
-    <w:p>
-      <w:pPr>
-        <w:numPr>
-          <w:ilvl w:val="0"/>
-          <w:numId w:val="10"/>
-        </w:numPr>
-        <w:spacing w:before="0" w:after="160" w:line="280" w:lineRule="auto"/>
-      </w:pPr>
-      <w:r>
-        <w:rPr>
-          <w:rFonts w:ascii="Calibri" w:hAnsi="Calibri" w:eastAsia="Calibri"/>
-          <w:color w:val="0B2545"/>
-          <w:sz w:val="22"/>
-        </w:rPr>
-        <w:t xml:space="preserve">Many-to-one merges of repeated prices and hotel attributes; interpretation of </w:t>
+        <w:t xml:space="preserve">Append annual price extracts, merge hotel attributes, and inspect </w:t>
       </w:r>
       <w:r>
         <w:rPr>
@@ -2158,39 +2061,7 @@
           <w:color w:val="0B2545"/>
           <w:sz w:val="22"/>
         </w:rPr>
-        <w:t xml:space="preserve">Wide and long search-date data, </w:t>
-      </w:r>
-      <w:r>
-        <w:rPr>
-          <w:rFonts w:ascii="Consolas" w:hAnsi="Consolas" w:eastAsia="Consolas"/>
-          <w:color w:val="1F4D78"/>
-          <w:sz w:val="19"/>
-        </w:rPr>
-        <w:t>reshape</w:t>
-      </w:r>
-      <w:r>
-        <w:rPr>
-          <w:rFonts w:ascii="Calibri" w:hAnsi="Calibri" w:eastAsia="Calibri"/>
-          <w:color w:val="0B2545"/>
-          <w:sz w:val="22"/>
-        </w:rPr>
-        <w:t xml:space="preserve">, and </w:t>
-      </w:r>
-      <w:r>
-        <w:rPr>
-          <w:rFonts w:ascii="Consolas" w:hAnsi="Consolas" w:eastAsia="Consolas"/>
-          <w:color w:val="1F4D78"/>
-          <w:sz w:val="19"/>
-        </w:rPr>
-        <w:t>collapse</w:t>
-      </w:r>
-      <w:r>
-        <w:rPr>
-          <w:rFonts w:ascii="Calibri" w:hAnsi="Calibri" w:eastAsia="Calibri"/>
-          <w:color w:val="0B2545"/>
-          <w:sz w:val="22"/>
-        </w:rPr>
-        <w:t>.</w:t>
+        <w:t>Construct nightly price and save the full combined panel.</w:t>
       </w:r>
     </w:p>
     <w:p>
@@ -2207,20 +2078,7 @@
           <w:color w:val="0B2545"/>
           <w:sz w:val="22"/>
         </w:rPr>
-        <w:t>Checkpoint 2 (10%): reverse the merge perspective and reshape city-month aggregates.</w:t>
-      </w:r>
-    </w:p>
-    <w:p>
-      <w:pPr>
-        <w:pStyle w:val="Heading2"/>
-      </w:pPr>
-      <w:r>
-        <w:rPr>
-          <w:rFonts w:ascii="Calibri" w:hAnsi="Calibri" w:eastAsia="Calibri"/>
-          <w:color w:val="0B2545"/>
-          <w:sz w:val="22"/>
-        </w:rPr>
-        <w:t>Session 4 — 5 October · Programming in Stata</w:t>
+        <w:t>Checkpoint 2 (10%): reverse the merge direction using only 2018 prices and validate the result. No regression or reshaping is required.</w:t>
       </w:r>
     </w:p>
     <w:p>
@@ -2237,24 +2095,15 @@
           <w:color w:val="0B2545"/>
           <w:sz w:val="22"/>
         </w:rPr>
-        <w:t>Local macros and evaluation with backticks and apostrophes.</w:t>
+        <w:t xml:space="preserve">Materials: </w:t>
       </w:r>
-    </w:p>
-    <w:p>
-      <w:pPr>
-        <w:numPr>
-          <w:ilvl w:val="0"/>
-          <w:numId w:val="10"/>
-        </w:numPr>
-        <w:spacing w:before="0" w:after="160" w:line="280" w:lineRule="auto"/>
-      </w:pPr>
       <w:r>
         <w:rPr>
           <w:rFonts w:ascii="Consolas" w:hAnsi="Consolas" w:eastAsia="Consolas"/>
           <w:color w:val="1F4D78"/>
           <w:sz w:val="19"/>
         </w:rPr>
-        <w:t>foreach</w:t>
+        <w:t>session-03-combining-reshaping</w:t>
       </w:r>
       <w:r>
         <w:rPr>
@@ -2262,23 +2111,20 @@
           <w:color w:val="0B2545"/>
           <w:sz w:val="22"/>
         </w:rPr>
-        <w:t xml:space="preserve"> and </w:t>
+        <w:t>. Reshaping is optional.</w:t>
       </w:r>
-      <w:r>
-        <w:rPr>
-          <w:rFonts w:ascii="Consolas" w:hAnsi="Consolas" w:eastAsia="Consolas"/>
-          <w:color w:val="1F4D78"/>
-          <w:sz w:val="19"/>
-        </w:rPr>
-        <w:t>forvalues</w:t>
-      </w:r>
+    </w:p>
+    <w:p>
+      <w:pPr>
+        <w:pStyle w:val="Heading2"/>
+      </w:pPr>
       <w:r>
         <w:rPr>
           <w:rFonts w:ascii="Calibri" w:hAnsi="Calibri" w:eastAsia="Calibri"/>
           <w:color w:val="0B2545"/>
           <w:sz w:val="22"/>
         </w:rPr>
-        <w:t xml:space="preserve"> loops for genuinely repeated work.</w:t>
+        <w:t>Lecture 4 Running and interpreting regressions</w:t>
       </w:r>
     </w:p>
     <w:p>
@@ -2295,7 +2141,7 @@
           <w:color w:val="0B2545"/>
           <w:sz w:val="22"/>
         </w:rPr>
-        <w:t>Conditional execution based on data and stored results.</w:t>
+        <w:t>Taught on 5 October, after Lecture 3.</w:t>
       </w:r>
     </w:p>
     <w:p>
@@ -2312,39 +2158,7 @@
           <w:color w:val="0B2545"/>
           <w:sz w:val="22"/>
         </w:rPr>
-        <w:t xml:space="preserve">Small r-class programs, </w:t>
-      </w:r>
-      <w:r>
-        <w:rPr>
-          <w:rFonts w:ascii="Consolas" w:hAnsi="Consolas" w:eastAsia="Consolas"/>
-          <w:color w:val="1F4D78"/>
-          <w:sz w:val="19"/>
-        </w:rPr>
-        <w:t>syntax</w:t>
-      </w:r>
-      <w:r>
-        <w:rPr>
-          <w:rFonts w:ascii="Calibri" w:hAnsi="Calibri" w:eastAsia="Calibri"/>
-          <w:color w:val="0B2545"/>
-          <w:sz w:val="22"/>
-        </w:rPr>
-        <w:t xml:space="preserve">, </w:t>
-      </w:r>
-      <w:r>
-        <w:rPr>
-          <w:rFonts w:ascii="Consolas" w:hAnsi="Consolas" w:eastAsia="Consolas"/>
-          <w:color w:val="1F4D78"/>
-          <w:sz w:val="19"/>
-        </w:rPr>
-        <w:t>marksample</w:t>
-      </w:r>
-      <w:r>
-        <w:rPr>
-          <w:rFonts w:ascii="Calibri" w:hAnsi="Calibri" w:eastAsia="Calibri"/>
-          <w:color w:val="0B2545"/>
-          <w:sz w:val="22"/>
-        </w:rPr>
-        <w:t>, and returned scalars.</w:t>
+        <w:t>Run simple and multiple regressions manually on the same complete sample.</w:t>
       </w:r>
     </w:p>
     <w:p>
@@ -2361,20 +2175,7 @@
           <w:color w:val="0B2545"/>
           <w:sz w:val="22"/>
         </w:rPr>
-        <w:t>Checkpoint 3 (10%): automate cutoff comparisons with a reusable spread-summary program.</w:t>
-      </w:r>
-    </w:p>
-    <w:p>
-      <w:pPr>
-        <w:pStyle w:val="Heading2"/>
-      </w:pPr>
-      <w:r>
-        <w:rPr>
-          <w:rFonts w:ascii="Calibri" w:hAnsi="Calibri" w:eastAsia="Calibri"/>
-          <w:color w:val="0B2545"/>
-          <w:sz w:val="22"/>
-        </w:rPr>
-        <w:t>Session 5 — 12 October · Descriptive analysis and graphics</w:t>
+        <w:t>Interpret coefficients in their units and distinguish association from causation.</w:t>
       </w:r>
     </w:p>
     <w:p>
@@ -2391,7 +2192,7 @@
           <w:color w:val="0B2545"/>
           <w:sz w:val="22"/>
         </w:rPr>
-        <w:t>Choosing descriptive statistics for variables and questions.</w:t>
+        <w:t>Add categorical controls and change the outcome to log nightly price.</w:t>
       </w:r>
     </w:p>
     <w:p>
@@ -2408,7 +2209,7 @@
           <w:color w:val="0B2545"/>
           <w:sz w:val="22"/>
         </w:rPr>
-        <w:t>Grouped tables, correlations, aggregation, and export.</w:t>
+        <w:t>Distinguish price quotes from hotels; cluster standard errors by hotel.</w:t>
       </w:r>
     </w:p>
     <w:p>
@@ -2425,7 +2226,7 @@
           <w:color w:val="0B2545"/>
           <w:sz w:val="22"/>
         </w:rPr>
-        <w:t>Histograms, bar charts, scatterplots, fitted lines, labels, and graph export.</w:t>
+        <w:t>Checkpoint 3 (10%): use rating as the main predictor, compare specifications, and interpret results. No macros or loops are required.</w:t>
       </w:r>
     </w:p>
     <w:p>
@@ -2442,7 +2243,36 @@
           <w:color w:val="0B2545"/>
           <w:sz w:val="22"/>
         </w:rPr>
-        <w:t>Distinguishing informative graphics from decorative output.</w:t>
+        <w:t xml:space="preserve">Materials: </w:t>
+      </w:r>
+      <w:r>
+        <w:rPr>
+          <w:rFonts w:ascii="Consolas" w:hAnsi="Consolas" w:eastAsia="Consolas"/>
+          <w:color w:val="1F4D78"/>
+          <w:sz w:val="19"/>
+        </w:rPr>
+        <w:t>session-04-programming</w:t>
+      </w:r>
+      <w:r>
+        <w:rPr>
+          <w:rFonts w:ascii="Calibri" w:hAnsi="Calibri" w:eastAsia="Calibri"/>
+          <w:color w:val="0B2545"/>
+          <w:sz w:val="22"/>
+        </w:rPr>
+        <w:t>; the folder name is retained for existing links.</w:t>
+      </w:r>
+    </w:p>
+    <w:p>
+      <w:pPr>
+        <w:pStyle w:val="Heading2"/>
+      </w:pPr>
+      <w:r>
+        <w:rPr>
+          <w:rFonts w:ascii="Calibri" w:hAnsi="Calibri" w:eastAsia="Calibri"/>
+          <w:color w:val="0B2545"/>
+          <w:sz w:val="22"/>
+        </w:rPr>
+        <w:t>Lecture 5 Automating regressions</w:t>
       </w:r>
     </w:p>
     <w:p>
@@ -2459,20 +2289,7 @@
           <w:color w:val="0B2545"/>
           <w:sz w:val="22"/>
         </w:rPr>
-        <w:t>Checkpoint 4 (10%): compare star categories with robust summaries and two purposeful graphs.</w:t>
-      </w:r>
-    </w:p>
-    <w:p>
-      <w:pPr>
-        <w:pStyle w:val="Heading2"/>
-      </w:pPr>
-      <w:r>
-        <w:rPr>
-          <w:rFonts w:ascii="Calibri" w:hAnsi="Calibri" w:eastAsia="Calibri"/>
-          <w:color w:val="0B2545"/>
-          <w:sz w:val="22"/>
-        </w:rPr>
-        <w:t>Session 6 — 19 October · Final in-class exam</w:t>
+        <w:t>Taught on 12 October, after students have learned to run regressions manually.</w:t>
       </w:r>
     </w:p>
     <w:p>
@@ -2489,7 +2306,7 @@
           <w:color w:val="0B2545"/>
           <w:sz w:val="22"/>
         </w:rPr>
-        <w:t>Individual final exam, worth 60% of the total course score.</w:t>
+        <w:t>Repeat a model at different price cutoffs and identify the text that changes.</w:t>
       </w:r>
     </w:p>
     <w:p>
@@ -2506,7 +2323,7 @@
           <w:color w:val="0B2545"/>
           <w:sz w:val="22"/>
         </w:rPr>
-        <w:t>Scope: material taught in Sessions 1–5.</w:t>
+        <w:t>Define local macros for the outcome, predictors, and cutoffs.</w:t>
       </w:r>
     </w:p>
     <w:p>
@@ -2523,7 +2340,23 @@
           <w:color w:val="0B2545"/>
           <w:sz w:val="22"/>
         </w:rPr>
-        <w:t>No new lecture and no checkpoint.</w:t>
+        <w:t xml:space="preserve">Use </w:t>
+      </w:r>
+      <w:r>
+        <w:rPr>
+          <w:rFonts w:ascii="Consolas" w:hAnsi="Consolas" w:eastAsia="Consolas"/>
+          <w:color w:val="1F4D78"/>
+          <w:sz w:val="19"/>
+        </w:rPr>
+        <w:t>foreach</w:t>
+      </w:r>
+      <w:r>
+        <w:rPr>
+          <w:rFonts w:ascii="Calibri" w:hAnsi="Calibri" w:eastAsia="Calibri"/>
+          <w:color w:val="0B2545"/>
+          <w:sz w:val="22"/>
+        </w:rPr>
+        <w:t>, report sample sizes and coefficients, and verify an iteration manually.</w:t>
       </w:r>
     </w:p>
     <w:p>
@@ -2540,16 +2373,49 @@
           <w:color w:val="0B2545"/>
           <w:sz w:val="22"/>
         </w:rPr>
-        <w:t xml:space="preserve">Detailed exam instructions: </w:t>
+        <w:t>Explain how outcome-based sample restrictions change the comparison.</w:t>
+      </w:r>
+    </w:p>
+    <w:p>
+      <w:pPr>
+        <w:numPr>
+          <w:ilvl w:val="0"/>
+          <w:numId w:val="10"/>
+        </w:numPr>
+        <w:spacing w:before="0" w:after="160" w:line="280" w:lineRule="auto"/>
+      </w:pPr>
+      <w:r>
+        <w:rPr>
+          <w:rFonts w:ascii="Calibri" w:hAnsi="Calibri" w:eastAsia="Calibri"/>
+          <w:color w:val="0B2545"/>
+          <w:sz w:val="22"/>
+        </w:rPr>
+        <w:t>Checkpoint 4 (10%): automate regressions using a central-hotel indicator in place of continuous distance; interpret and validate results.</w:t>
+      </w:r>
+    </w:p>
+    <w:p>
+      <w:pPr>
+        <w:numPr>
+          <w:ilvl w:val="0"/>
+          <w:numId w:val="10"/>
+        </w:numPr>
+        <w:spacing w:before="0" w:after="160" w:line="280" w:lineRule="auto"/>
+      </w:pPr>
+      <w:r>
+        <w:rPr>
+          <w:rFonts w:ascii="Calibri" w:hAnsi="Calibri" w:eastAsia="Calibri"/>
+          <w:color w:val="0B2545"/>
+          <w:sz w:val="22"/>
+        </w:rPr>
+        <w:t xml:space="preserve">Materials: </w:t>
       </w:r>
       <w:r>
         <w:rPr>
-          <w:rFonts w:ascii="Calibri" w:hAnsi="Calibri" w:eastAsia="Calibri"/>
-          <w:b/>
-          <w:color w:val="0B2545"/>
-          <w:sz w:val="22"/>
+          <w:rFonts w:ascii="Consolas" w:hAnsi="Consolas" w:eastAsia="Consolas"/>
+          <w:color w:val="1F4D78"/>
+          <w:sz w:val="19"/>
         </w:rPr>
-        <w:t>TBD</w:t>
+        <w:t>session-05-descriptives-graphics</w:t>
       </w:r>
       <w:r>
         <w:rPr>
@@ -2557,7 +2423,20 @@
           <w:color w:val="0B2545"/>
           <w:sz w:val="22"/>
         </w:rPr>
-        <w:t>, to be announced before the exam.</w:t>
+        <w:t>; the folder name is retained for links.</w:t>
+      </w:r>
+    </w:p>
+    <w:p>
+      <w:pPr>
+        <w:pStyle w:val="Heading2"/>
+      </w:pPr>
+      <w:r>
+        <w:rPr>
+          <w:rFonts w:ascii="Calibri" w:hAnsi="Calibri" w:eastAsia="Calibri"/>
+          <w:color w:val="0B2545"/>
+          <w:sz w:val="22"/>
+        </w:rPr>
+        <w:t>Remaining meetings</w:t>
       </w:r>
     </w:p>
     <w:p>
@@ -2570,7 +2449,113 @@
           <w:color w:val="0B2545"/>
           <w:sz w:val="22"/>
         </w:rPr>
-        <w:t xml:space="preserve">The existing </w:t>
+        <w:t xml:space="preserve">On </w:t>
+      </w:r>
+      <w:r>
+        <w:rPr>
+          <w:rFonts w:ascii="Calibri" w:hAnsi="Calibri" w:eastAsia="Calibri"/>
+          <w:b/>
+          <w:color w:val="0B2545"/>
+          <w:sz w:val="22"/>
+        </w:rPr>
+        <w:t>5 October</w:t>
+      </w:r>
+      <w:r>
+        <w:rPr>
+          <w:rFonts w:ascii="Calibri" w:hAnsi="Calibri" w:eastAsia="Calibri"/>
+          <w:color w:val="0B2545"/>
+          <w:sz w:val="22"/>
+        </w:rPr>
+        <w:t xml:space="preserve">, Lectures 3 and 4 and their checkpoints share the 100-minute meeting. On </w:t>
+      </w:r>
+      <w:r>
+        <w:rPr>
+          <w:rFonts w:ascii="Calibri" w:hAnsi="Calibri" w:eastAsia="Calibri"/>
+          <w:b/>
+          <w:color w:val="0B2545"/>
+          <w:sz w:val="22"/>
+        </w:rPr>
+        <w:t>12 October</w:t>
+      </w:r>
+      <w:r>
+        <w:rPr>
+          <w:rFonts w:ascii="Calibri" w:hAnsi="Calibri" w:eastAsia="Calibri"/>
+          <w:color w:val="0B2545"/>
+          <w:sz w:val="22"/>
+        </w:rPr>
+        <w:t xml:space="preserve">, Lecture 5 and its checkpoint use the 100-minute meeting. The detailed agendas are in </w:t>
+      </w:r>
+      <w:r>
+        <w:rPr>
+          <w:rFonts w:ascii="Consolas" w:hAnsi="Consolas" w:eastAsia="Consolas"/>
+          <w:color w:val="1F4D78"/>
+          <w:sz w:val="19"/>
+        </w:rPr>
+        <w:t>schedule/session_plan.md</w:t>
+      </w:r>
+      <w:r>
+        <w:rPr>
+          <w:rFonts w:ascii="Calibri" w:hAnsi="Calibri" w:eastAsia="Calibri"/>
+          <w:color w:val="0B2545"/>
+          <w:sz w:val="22"/>
+        </w:rPr>
+        <w:t>.</w:t>
+      </w:r>
+    </w:p>
+    <w:p>
+      <w:pPr>
+        <w:widowControl/>
+      </w:pPr>
+      <w:r>
+        <w:rPr>
+          <w:rFonts w:ascii="Calibri" w:hAnsi="Calibri" w:eastAsia="Calibri"/>
+          <w:color w:val="0B2545"/>
+          <w:sz w:val="22"/>
+        </w:rPr>
+        <w:t xml:space="preserve">The exam remains on </w:t>
+      </w:r>
+      <w:r>
+        <w:rPr>
+          <w:rFonts w:ascii="Calibri" w:hAnsi="Calibri" w:eastAsia="Calibri"/>
+          <w:b/>
+          <w:color w:val="0B2545"/>
+          <w:sz w:val="22"/>
+        </w:rPr>
+        <w:t>Monday, 19 October 2026, 08:50–10:30</w:t>
+      </w:r>
+      <w:r>
+        <w:rPr>
+          <w:rFonts w:ascii="Calibri" w:hAnsi="Calibri" w:eastAsia="Calibri"/>
+          <w:color w:val="0B2545"/>
+          <w:sz w:val="22"/>
+        </w:rPr>
+        <w:t>, worth 60%. It covers the core material actually taught in the five teaching meetings, including regression and regression automation. There is no new lecture or checkpoint in the exam meeting. Detailed instructions will be provided separately.</w:t>
+      </w:r>
+    </w:p>
+    <w:p>
+      <w:pPr>
+        <w:pStyle w:val="Heading2"/>
+      </w:pPr>
+      <w:r>
+        <w:rPr>
+          <w:rFonts w:ascii="Calibri" w:hAnsi="Calibri" w:eastAsia="Calibri"/>
+          <w:color w:val="0B2545"/>
+          <w:sz w:val="22"/>
+        </w:rPr>
+        <w:t>Optional reference material</w:t>
+      </w:r>
+    </w:p>
+    <w:p>
+      <w:pPr>
+        <w:widowControl/>
+      </w:pPr>
+      <w:r>
+        <w:rPr>
+          <w:rFonts w:ascii="Calibri" w:hAnsi="Calibri" w:eastAsia="Calibri"/>
+          <w:color w:val="0B2545"/>
+          <w:sz w:val="22"/>
+        </w:rPr>
+        <w:t xml:space="preserve">Reshaping, custom programs, the former graphics lecture and exercise, adjusted predictions, residual diagnostics, and resampling remain available as optional, ungraded reference. They are outside the required exam material. Optional files are named explicitly in the lecture guides. The </w:t>
       </w:r>
       <w:r>
         <w:rPr>
@@ -2586,7 +2571,7 @@
           <w:color w:val="0B2545"/>
           <w:sz w:val="22"/>
         </w:rPr>
-        <w:t xml:space="preserve"> scripts remain available as supplementary, ungraded material. They are not the exam paper or a sixth teaching session.</w:t>
+        <w:t xml:space="preserve"> files are supplementary examples, not the exam paper or an additional teaching session.</w:t>
       </w:r>
     </w:p>
     <w:p>

</xml_diff>

<commit_message>
Rename session 4 to regressions and shorten its exercise
</commit_message>
<xml_diff>
--- a/Introduction-to-Stata-Syllabus.docx
+++ b/Introduction-to-Stata-Syllabus.docx
@@ -1834,7 +1834,7 @@
           <w:color w:val="0B2545"/>
           <w:sz w:val="22"/>
         </w:rPr>
-        <w:t>. Lecture-folder names are retained for stable links; their numbers identify material rather than separate remaining dates.</w:t>
+        <w:t>. Lecture-folder numbers identify material rather than separate remaining dates.</w:t>
       </w:r>
     </w:p>
     <w:p>
@@ -2251,7 +2251,7 @@
           <w:color w:val="1F4D78"/>
           <w:sz w:val="19"/>
         </w:rPr>
-        <w:t>session-04-programming</w:t>
+        <w:t>session-04-regressions</w:t>
       </w:r>
       <w:r>
         <w:rPr>
@@ -2259,7 +2259,7 @@
           <w:color w:val="0B2545"/>
           <w:sz w:val="22"/>
         </w:rPr>
-        <w:t>; the folder name is retained for existing links.</w:t>
+        <w:t>.</w:t>
       </w:r>
     </w:p>
     <w:p>

</xml_diff>

<commit_message>
Teach programming foundations and graphics in Lecture 5
Revise checkpoint 4, include basic graphics in the exam scope, and synchronize the session plan, teaching guides, and syllabus. Keep extended regression automation optional and preserve instructor-only exclusions.
</commit_message>
<xml_diff>
--- a/Introduction-to-Stata-Syllabus.docx
+++ b/Introduction-to-Stata-Syllabus.docx
@@ -10,7 +10,7 @@
         <w:rPr>
           <w:rFonts w:ascii="Calibri" w:hAnsi="Calibri" w:eastAsia="Calibri"/>
           <w:b/>
-          <w:color w:val="2E74B5"/>
+          <w:color w:val="000000"/>
           <w:sz w:val="20"/>
         </w:rPr>
         <w:t>ECBS5241 · FALL 2026–2027</w:t>
@@ -18,14 +18,16 @@
     </w:p>
     <w:p>
       <w:pPr>
+        <w:pStyle w:val="Title"/>
         <w:spacing w:before="0" w:after="80"/>
       </w:pPr>
       <w:r>
         <w:rPr>
           <w:rFonts w:ascii="Calibri" w:hAnsi="Calibri" w:eastAsia="Calibri"/>
           <w:b/>
-          <w:color w:val="0B2545"/>
+          <w:color w:val="000000"/>
           <w:sz w:val="58"/>
+          <w:u w:val="none"/>
         </w:rPr>
         <w:t>Introduction to Stata</w:t>
       </w:r>
@@ -33,14 +35,11 @@
     <w:p>
       <w:pPr>
         <w:spacing w:before="0" w:after="240"/>
-        <w:pBdr>
-          <w:bottom w:val="single" w:sz="10" w:space="7" w:color="2E74B5"/>
-        </w:pBdr>
       </w:pPr>
       <w:r>
         <w:rPr>
           <w:rFonts w:ascii="Calibri" w:hAnsi="Calibri" w:eastAsia="Calibri"/>
-          <w:color w:val="666666"/>
+          <w:color w:val="000000"/>
           <w:sz w:val="28"/>
         </w:rPr>
         <w:t>Reproducible data work for economics and public policy</w:t>
@@ -587,8 +586,9 @@
       <w:r>
         <w:rPr>
           <w:rFonts w:ascii="Calibri" w:hAnsi="Calibri" w:eastAsia="Calibri"/>
-          <w:color w:val="0B2545"/>
+          <w:color w:val="000000"/>
           <w:sz w:val="22"/>
+          <w:u w:val="none"/>
         </w:rPr>
         <w:t>Background and overall aim</w:t>
       </w:r>
@@ -599,20 +599,12 @@
       </w:pPr>
       <w:r>
         <w:rPr>
-          <w:rFonts w:ascii="Calibri" w:hAnsi="Calibri" w:eastAsia="Calibri"/>
           <w:b/>
-          <w:color w:val="0B2545"/>
-          <w:sz w:val="22"/>
         </w:rPr>
         <w:t>Content.</w:t>
       </w:r>
       <w:r>
-        <w:rPr>
-          <w:rFonts w:ascii="Calibri" w:hAnsi="Calibri" w:eastAsia="Calibri"/>
-          <w:color w:val="0B2545"/>
-          <w:sz w:val="22"/>
-        </w:rPr>
-        <w:t xml:space="preserve"> This course introduces Stata as a reproducible research environment. Students learn to organize a project, write and run do-files, import and validate data, clean and transform variables, combine datasets, run and interpret regressions, automate repeated regressions, and interpret descriptive and regression output. Reshaping is an optional extension. The five teaching sessions contribute to one complete workflow that can be rerun from raw data. The sixth meeting is the final in-class exam.</w:t>
+        <w:t xml:space="preserve"> This course introduces Stata as a reproducible research environment. Students learn to organize a project, write and run do-files, import and validate data, clean and transform variables, combine datasets, run and interpret regressions, use macros and loops, and create and interpret basic graphics and descriptive output. Reshaping is an optional extension. The five teaching sessions contribute to one complete workflow that can be rerun from raw data. The sixth meeting is the final in-class exam.</w:t>
       </w:r>
     </w:p>
     <w:p>
@@ -666,8 +658,9 @@
       <w:r>
         <w:rPr>
           <w:rFonts w:ascii="Calibri" w:hAnsi="Calibri" w:eastAsia="Calibri"/>
-          <w:color w:val="0B2545"/>
+          <w:color w:val="000000"/>
           <w:sz w:val="22"/>
+          <w:u w:val="none"/>
         </w:rPr>
         <w:t>Course prerequisites and technical requirements</w:t>
       </w:r>
@@ -798,8 +791,9 @@
       <w:r>
         <w:rPr>
           <w:rFonts w:ascii="Calibri" w:hAnsi="Calibri" w:eastAsia="Calibri"/>
-          <w:color w:val="0B2545"/>
+          <w:color w:val="000000"/>
           <w:sz w:val="22"/>
+          <w:u w:val="none"/>
         </w:rPr>
         <w:t>Waiting list handling</w:t>
       </w:r>
@@ -824,8 +818,9 @@
       <w:r>
         <w:rPr>
           <w:rFonts w:ascii="Calibri" w:hAnsi="Calibri" w:eastAsia="Calibri"/>
-          <w:color w:val="0B2545"/>
+          <w:color w:val="000000"/>
           <w:sz w:val="22"/>
+          <w:u w:val="none"/>
         </w:rPr>
         <w:t>Learning outcomes</w:t>
       </w:r>
@@ -955,12 +950,7 @@
         <w:spacing w:before="0" w:after="160" w:line="280" w:lineRule="auto"/>
       </w:pPr>
       <w:r>
-        <w:rPr>
-          <w:rFonts w:ascii="Calibri" w:hAnsi="Calibri" w:eastAsia="Calibri"/>
-          <w:color w:val="0B2545"/>
-          <w:sz w:val="22"/>
-        </w:rPr>
-        <w:t>Automate repeated regressions with local macros and loops, and verify an iteration against a manually specified regression.</w:t>
+        <w:t>Distinguish local and global macros, use locals with foreach and simple forvalues loops, and verify one iteration against manually written commands.</w:t>
       </w:r>
     </w:p>
     <w:p>
@@ -972,12 +962,7 @@
         <w:spacing w:before="0" w:after="160" w:line="280" w:lineRule="auto"/>
       </w:pPr>
       <w:r>
-        <w:rPr>
-          <w:rFonts w:ascii="Calibri" w:hAnsi="Calibri" w:eastAsia="Calibri"/>
-          <w:color w:val="0B2545"/>
-          <w:sz w:val="22"/>
-        </w:rPr>
-        <w:t>Read descriptive summaries and regression output and record results reproducibly.</w:t>
+        <w:t>Create and interpret histograms, box plots, and scatterplots with a fitted line; label samples and units, export figures, and read descriptive and regression output.</w:t>
       </w:r>
     </w:p>
     <w:p>
@@ -1002,12 +987,7 @@
         <w:widowControl/>
       </w:pPr>
       <w:r>
-        <w:rPr>
-          <w:rFonts w:ascii="Calibri" w:hAnsi="Calibri" w:eastAsia="Calibri"/>
-          <w:color w:val="0B2545"/>
-          <w:sz w:val="22"/>
-        </w:rPr>
-        <w:t>Optional materials cover reshaping, custom programs, additional graphics, adjusted predictions, and resampling. These extensions are outside the exam scope. Basic regression is part of the core teaching sequence, before programming.</w:t>
+        <w:t>Basic regression, programming foundations, and basic graphics are part of the core teaching and exam scope. Writing while loops, reshaping, custom programs, extended regression-cutoff analysis, additional table exports, adjusted predictions, and resampling are outside the exam scope. While is demonstrated for recognition only.</w:t>
       </w:r>
     </w:p>
     <w:p>
@@ -1017,8 +997,9 @@
       <w:r>
         <w:rPr>
           <w:rFonts w:ascii="Calibri" w:hAnsi="Calibri" w:eastAsia="Calibri"/>
-          <w:color w:val="0B2545"/>
+          <w:color w:val="000000"/>
           <w:sz w:val="22"/>
+          <w:u w:val="none"/>
         </w:rPr>
         <w:t>Learning activities and teaching methods</w:t>
       </w:r>
@@ -1089,12 +1070,7 @@
         <w:widowControl/>
       </w:pPr>
       <w:r>
-        <w:rPr>
-          <w:rFonts w:ascii="Calibri" w:hAnsi="Calibri" w:eastAsia="Calibri"/>
-          <w:color w:val="0B2545"/>
-          <w:sz w:val="22"/>
-        </w:rPr>
-        <w:t>Session 1's exercise is ungraded practice. Four individual, reproducible exercise attempts form the graded checkpoints during the teaching meetings. Checkpoint identifiers and weights are retained. The revised checkpoints cover cleaning, combining, regression, and regression automation. Submission details and any make-up arrangements are announced in class. There is no checkpoint in the exam meeting.</w:t>
+        <w:t>Session 1's exercise is ungraded practice. Four individual, reproducible exercise attempts form the graded checkpoints during the teaching meetings. Checkpoint identifiers and weights are retained. The four checkpoints cover cleaning; combining; regression; and programming with graphics. Submission details and any make-up arrangements are announced in class. There is no checkpoint in the exam meeting.</w:t>
       </w:r>
     </w:p>
     <w:p>
@@ -1117,8 +1093,9 @@
       <w:r>
         <w:rPr>
           <w:rFonts w:ascii="Calibri" w:hAnsi="Calibri" w:eastAsia="Calibri"/>
-          <w:color w:val="0B2545"/>
+          <w:color w:val="000000"/>
           <w:sz w:val="22"/>
+          <w:u w:val="none"/>
         </w:rPr>
         <w:t>Assessment</w:t>
       </w:r>
@@ -1530,8 +1507,9 @@
       <w:r>
         <w:rPr>
           <w:rFonts w:ascii="Calibri" w:hAnsi="Calibri" w:eastAsia="Calibri"/>
-          <w:color w:val="0B2545"/>
+          <w:color w:val="000000"/>
           <w:sz w:val="22"/>
+          <w:u w:val="none"/>
         </w:rPr>
         <w:t>In-class checkpoints</w:t>
       </w:r>
@@ -1655,8 +1633,9 @@
       <w:r>
         <w:rPr>
           <w:rFonts w:ascii="Calibri" w:hAnsi="Calibri" w:eastAsia="Calibri"/>
-          <w:color w:val="0B2545"/>
+          <w:color w:val="000000"/>
           <w:sz w:val="22"/>
+          <w:u w:val="none"/>
         </w:rPr>
         <w:t>Final in-class exam</w:t>
       </w:r>
@@ -1666,12 +1645,7 @@
         <w:widowControl/>
       </w:pPr>
       <w:r>
-        <w:rPr>
-          <w:rFonts w:ascii="Calibri" w:hAnsi="Calibri" w:eastAsia="Calibri"/>
-          <w:color w:val="0B2545"/>
-          <w:sz w:val="22"/>
-        </w:rPr>
-        <w:t>The individual final exam takes place during Session 6 on Monday, 19 October 2026, 08:50–10:30. This is the original scheduled exam slot and is unchanged. It assesses the Stata concepts and reproducible workflow taught in the five teaching meetings. There is no new lecture or separate checkpoint in this meeting.</w:t>
+        <w:t>The individual final exam takes place during Session 6 on Monday, 19 October 2026, 08:50–10:30. This is the original scheduled exam slot and is unchanged. It assesses the Stata concepts and reproducible workflow taught in the five teaching meetings, including basic graphics: histograms, box plots, scatterplots with a fitted line, labels, sample restrictions, interpretation, and PNG export. There is no new lecture or separate checkpoint in this meeting.</w:t>
       </w:r>
     </w:p>
     <w:p>
@@ -1711,8 +1685,9 @@
       <w:r>
         <w:rPr>
           <w:rFonts w:ascii="Calibri" w:hAnsi="Calibri" w:eastAsia="Calibri"/>
-          <w:color w:val="0B2545"/>
+          <w:color w:val="000000"/>
           <w:sz w:val="22"/>
+          <w:u w:val="none"/>
         </w:rPr>
         <w:t>AI and assistance policy</w:t>
       </w:r>
@@ -1767,8 +1742,9 @@
       <w:r>
         <w:rPr>
           <w:rFonts w:ascii="Calibri" w:hAnsi="Calibri" w:eastAsia="Calibri"/>
-          <w:color w:val="0B2545"/>
+          <w:color w:val="000000"/>
           <w:sz w:val="22"/>
+          <w:u w:val="none"/>
         </w:rPr>
         <w:t>Course contents and schedule</w:t>
       </w:r>
@@ -1778,62 +1754,33 @@
         <w:widowControl/>
       </w:pPr>
       <w:r>
-        <w:rPr>
-          <w:rFonts w:ascii="Calibri" w:hAnsi="Calibri" w:eastAsia="Calibri"/>
-          <w:color w:val="0B2545"/>
-          <w:sz w:val="22"/>
-        </w:rPr>
         <w:t xml:space="preserve">Lectures 1 and 2 and their exercises remain unchanged. The revised sequence keeps three separate lecture files: </w:t>
       </w:r>
       <w:r>
         <w:rPr>
-          <w:rFonts w:ascii="Calibri" w:hAnsi="Calibri" w:eastAsia="Calibri"/>
           <w:b/>
-          <w:color w:val="0B2545"/>
-          <w:sz w:val="22"/>
         </w:rPr>
         <w:t>combining data</w:t>
       </w:r>
       <w:r>
-        <w:rPr>
-          <w:rFonts w:ascii="Calibri" w:hAnsi="Calibri" w:eastAsia="Calibri"/>
-          <w:color w:val="0B2545"/>
-          <w:sz w:val="22"/>
-        </w:rPr>
         <w:t xml:space="preserve">, </w:t>
       </w:r>
       <w:r>
         <w:rPr>
-          <w:rFonts w:ascii="Calibri" w:hAnsi="Calibri" w:eastAsia="Calibri"/>
           <w:b/>
-          <w:color w:val="0B2545"/>
-          <w:sz w:val="22"/>
         </w:rPr>
         <w:t>running and interpreting regressions</w:t>
       </w:r>
       <w:r>
-        <w:rPr>
-          <w:rFonts w:ascii="Calibri" w:hAnsi="Calibri" w:eastAsia="Calibri"/>
-          <w:color w:val="0B2545"/>
-          <w:sz w:val="22"/>
-        </w:rPr>
         <w:t xml:space="preserve">, and </w:t>
       </w:r>
       <w:r>
         <w:rPr>
-          <w:rFonts w:ascii="Calibri" w:hAnsi="Calibri" w:eastAsia="Calibri"/>
           <w:b/>
-          <w:color w:val="0B2545"/>
-          <w:sz w:val="22"/>
         </w:rPr>
-        <w:t>automating regressions</w:t>
+        <w:t>programming and graphics</w:t>
       </w:r>
       <w:r>
-        <w:rPr>
-          <w:rFonts w:ascii="Calibri" w:hAnsi="Calibri" w:eastAsia="Calibri"/>
-          <w:color w:val="0B2545"/>
-          <w:sz w:val="22"/>
-        </w:rPr>
         <w:t>. Lecture-folder numbers identify material rather than separate remaining dates.</w:t>
       </w:r>
     </w:p>
@@ -1844,8 +1791,9 @@
       <w:r>
         <w:rPr>
           <w:rFonts w:ascii="Calibri" w:hAnsi="Calibri" w:eastAsia="Calibri"/>
-          <w:color w:val="0B2545"/>
+          <w:color w:val="000000"/>
           <w:sz w:val="22"/>
+          <w:u w:val="none"/>
         </w:rPr>
         <w:t>Workflow and cleaning foundations</w:t>
       </w:r>
@@ -1974,8 +1922,9 @@
       <w:r>
         <w:rPr>
           <w:rFonts w:ascii="Calibri" w:hAnsi="Calibri" w:eastAsia="Calibri"/>
-          <w:color w:val="0B2545"/>
+          <w:color w:val="000000"/>
           <w:sz w:val="22"/>
+          <w:u w:val="none"/>
         </w:rPr>
         <w:t>Lecture 3 Combining data</w:t>
       </w:r>
@@ -2121,8 +2070,9 @@
       <w:r>
         <w:rPr>
           <w:rFonts w:ascii="Calibri" w:hAnsi="Calibri" w:eastAsia="Calibri"/>
-          <w:color w:val="0B2545"/>
+          <w:color w:val="000000"/>
           <w:sz w:val="22"/>
+          <w:u w:val="none"/>
         </w:rPr>
         <w:t>Lecture 4 Running and interpreting regressions</w:t>
       </w:r>
@@ -2268,11 +2218,10 @@
       </w:pPr>
       <w:r>
         <w:rPr>
-          <w:rFonts w:ascii="Calibri" w:hAnsi="Calibri" w:eastAsia="Calibri"/>
-          <w:color w:val="0B2545"/>
-          <w:sz w:val="22"/>
+          <w:color w:val="000000"/>
+          <w:u w:val="none"/>
         </w:rPr>
-        <w:t>Lecture 5 Automating regressions</w:t>
+        <w:t>Lecture 5 Programming basics and reproducible graphics</w:t>
       </w:r>
     </w:p>
     <w:p>
@@ -2301,12 +2250,7 @@
         <w:spacing w:before="0" w:after="160" w:line="280" w:lineRule="auto"/>
       </w:pPr>
       <w:r>
-        <w:rPr>
-          <w:rFonts w:ascii="Calibri" w:hAnsi="Calibri" w:eastAsia="Calibri"/>
-          <w:color w:val="0B2545"/>
-          <w:sz w:val="22"/>
-        </w:rPr>
-        <w:t>Repeat a model at different price cutoffs and identify the text that changes.</w:t>
+        <w:t>Explain macros, text substitution, expressions, local scope, and global scope.</w:t>
       </w:r>
     </w:p>
     <w:p>
@@ -2318,12 +2262,34 @@
         <w:spacing w:before="0" w:after="160" w:line="280" w:lineRule="auto"/>
       </w:pPr>
       <w:r>
+        <w:t xml:space="preserve">Practise </w:t>
+      </w:r>
+      <w:r>
         <w:rPr>
-          <w:rFonts w:ascii="Calibri" w:hAnsi="Calibri" w:eastAsia="Calibri"/>
-          <w:color w:val="0B2545"/>
-          <w:sz w:val="22"/>
+          <w:rFonts w:ascii="Consolas" w:hAnsi="Consolas"/>
         </w:rPr>
-        <w:t>Define local macros for the outcome, predictors, and cutoffs.</w:t>
+        <w:t>foreach</w:t>
+      </w:r>
+      <w:r>
+        <w:t xml:space="preserve"> and simple </w:t>
+      </w:r>
+      <w:r>
+        <w:rPr>
+          <w:rFonts w:ascii="Consolas" w:hAnsi="Consolas"/>
+        </w:rPr>
+        <w:t>forvalues</w:t>
+      </w:r>
+      <w:r>
+        <w:t xml:space="preserve"> loops; briefly demonstrate </w:t>
+      </w:r>
+      <w:r>
+        <w:rPr>
+          <w:rFonts w:ascii="Consolas" w:hAnsi="Consolas"/>
+        </w:rPr>
+        <w:t>while</w:t>
+      </w:r>
+      <w:r>
+        <w:t>.</w:t>
       </w:r>
     </w:p>
     <w:p>
@@ -2335,28 +2301,7 @@
         <w:spacing w:before="0" w:after="160" w:line="280" w:lineRule="auto"/>
       </w:pPr>
       <w:r>
-        <w:rPr>
-          <w:rFonts w:ascii="Calibri" w:hAnsi="Calibri" w:eastAsia="Calibri"/>
-          <w:color w:val="0B2545"/>
-          <w:sz w:val="22"/>
-        </w:rPr>
-        <w:t xml:space="preserve">Use </w:t>
-      </w:r>
-      <w:r>
-        <w:rPr>
-          <w:rFonts w:ascii="Consolas" w:hAnsi="Consolas" w:eastAsia="Consolas"/>
-          <w:color w:val="1F4D78"/>
-          <w:sz w:val="19"/>
-        </w:rPr>
-        <w:t>foreach</w:t>
-      </w:r>
-      <w:r>
-        <w:rPr>
-          <w:rFonts w:ascii="Calibri" w:hAnsi="Calibri" w:eastAsia="Calibri"/>
-          <w:color w:val="0B2545"/>
-          <w:sz w:val="22"/>
-        </w:rPr>
-        <w:t>, report sample sizes and coefficients, and verify an iteration manually.</w:t>
+        <w:t>Build histograms, box plots, and scatterplots with a fitted line; explain samples, units, bin widths, distributions, and associations.</w:t>
       </w:r>
     </w:p>
     <w:p>
@@ -2368,12 +2313,7 @@
         <w:spacing w:before="0" w:after="160" w:line="280" w:lineRule="auto"/>
       </w:pPr>
       <w:r>
-        <w:rPr>
-          <w:rFonts w:ascii="Calibri" w:hAnsi="Calibri" w:eastAsia="Calibri"/>
-          <w:color w:val="0B2545"/>
-          <w:sz w:val="22"/>
-        </w:rPr>
-        <w:t>Explain how outcome-based sample restrictions change the comparison.</w:t>
+        <w:t>Use a city loop to label and export figures, then check one result manually.</w:t>
       </w:r>
     </w:p>
     <w:p>
@@ -2385,12 +2325,16 @@
         <w:spacing w:before="0" w:after="160" w:line="280" w:lineRule="auto"/>
       </w:pPr>
       <w:r>
+        <w:t xml:space="preserve">Checkpoint 4 (10%): use locals and </w:t>
+      </w:r>
+      <w:r>
         <w:rPr>
-          <w:rFonts w:ascii="Calibri" w:hAnsi="Calibri" w:eastAsia="Calibri"/>
-          <w:color w:val="0B2545"/>
-          <w:sz w:val="22"/>
+          <w:rFonts w:ascii="Consolas" w:hAnsi="Consolas"/>
         </w:rPr>
-        <w:t>Checkpoint 4 (10%): automate regressions using a central-hotel indicator in place of continuous distance; interpret and validate results.</w:t>
+        <w:t>foreach</w:t>
+      </w:r>
+      <w:r>
+        <w:t xml:space="preserve"> to make guest-rating histograms for Budapest and Zagreb, verify Budapest manually, and interpret the graphs. Submit a do-file, log, and two city-specific PNGs. Allow 25 minutes.</w:t>
       </w:r>
     </w:p>
     <w:p>
@@ -2433,8 +2377,9 @@
       <w:r>
         <w:rPr>
           <w:rFonts w:ascii="Calibri" w:hAnsi="Calibri" w:eastAsia="Calibri"/>
-          <w:color w:val="0B2545"/>
+          <w:color w:val="000000"/>
           <w:sz w:val="22"/>
+          <w:u w:val="none"/>
         </w:rPr>
         <w:t>Remaining meetings</w:t>
       </w:r>
@@ -2507,29 +2452,16 @@
         <w:widowControl/>
       </w:pPr>
       <w:r>
-        <w:rPr>
-          <w:rFonts w:ascii="Calibri" w:hAnsi="Calibri" w:eastAsia="Calibri"/>
-          <w:color w:val="0B2545"/>
-          <w:sz w:val="22"/>
-        </w:rPr>
         <w:t xml:space="preserve">The exam remains on </w:t>
       </w:r>
       <w:r>
         <w:rPr>
-          <w:rFonts w:ascii="Calibri" w:hAnsi="Calibri" w:eastAsia="Calibri"/>
           <w:b/>
-          <w:color w:val="0B2545"/>
-          <w:sz w:val="22"/>
         </w:rPr>
         <w:t>Monday, 19 October 2026, 08:50–10:30</w:t>
       </w:r>
       <w:r>
-        <w:rPr>
-          <w:rFonts w:ascii="Calibri" w:hAnsi="Calibri" w:eastAsia="Calibri"/>
-          <w:color w:val="0B2545"/>
-          <w:sz w:val="22"/>
-        </w:rPr>
-        <w:t>, worth 60%. It covers the core material actually taught in the five teaching meetings, including regression and regression automation. There is no new lecture or checkpoint in the exam meeting. Detailed instructions will be provided separately.</w:t>
+        <w:t>, worth 60%. It covers the core material actually taught in the five teaching meetings, including regression, local macros, the local/global distinction, foreach and simple forvalues loops, and basic graphics. There is no new lecture or checkpoint in the exam meeting. Detailed instructions will be provided separately.</w:t>
       </w:r>
     </w:p>
     <w:p>
@@ -2539,8 +2471,9 @@
       <w:r>
         <w:rPr>
           <w:rFonts w:ascii="Calibri" w:hAnsi="Calibri" w:eastAsia="Calibri"/>
-          <w:color w:val="0B2545"/>
+          <w:color w:val="000000"/>
           <w:sz w:val="22"/>
+          <w:u w:val="none"/>
         </w:rPr>
         <w:t>Optional reference material</w:t>
       </w:r>
@@ -2550,27 +2483,15 @@
         <w:widowControl/>
       </w:pPr>
       <w:r>
-        <w:rPr>
-          <w:rFonts w:ascii="Calibri" w:hAnsi="Calibri" w:eastAsia="Calibri"/>
-          <w:color w:val="0B2545"/>
-          <w:sz w:val="22"/>
-        </w:rPr>
-        <w:t xml:space="preserve">Reshaping, custom programs, the former graphics lecture and exercise, adjusted predictions, residual diagnostics, and resampling remain available as optional, ungraded reference. They are outside the required exam material. Optional files are named explicitly in the lecture guides. The </w:t>
+        <w:t xml:space="preserve">Reshaping, custom programs, extended regression-cutoff analysis, additional table exports, adjusted predictions, residual diagnostics, and resampling remain optional, ungraded reference. Optional files add no exam requirements; basic graph types taught in Lecture 5 remain required even if optional files also use them. Writing while loops is not required. Optional files are named in the lecture guides. The </w:t>
       </w:r>
       <w:r>
         <w:rPr>
-          <w:rFonts w:ascii="Consolas" w:hAnsi="Consolas" w:eastAsia="Consolas"/>
-          <w:color w:val="1F4D78"/>
-          <w:sz w:val="19"/>
+          <w:rFonts w:ascii="Consolas" w:hAnsi="Consolas"/>
         </w:rPr>
         <w:t>session-06-analysis-simulation</w:t>
       </w:r>
       <w:r>
-        <w:rPr>
-          <w:rFonts w:ascii="Calibri" w:hAnsi="Calibri" w:eastAsia="Calibri"/>
-          <w:color w:val="0B2545"/>
-          <w:sz w:val="22"/>
-        </w:rPr>
         <w:t xml:space="preserve"> files are supplementary examples, not the exam paper or an additional teaching session.</w:t>
       </w:r>
     </w:p>
@@ -2581,8 +2502,9 @@
       <w:r>
         <w:rPr>
           <w:rFonts w:ascii="Calibri" w:hAnsi="Calibri" w:eastAsia="Calibri"/>
-          <w:color w:val="0B2545"/>
+          <w:color w:val="000000"/>
           <w:sz w:val="22"/>
+          <w:u w:val="none"/>
         </w:rPr>
         <w:t>Course materials and reproducibility</w:t>
       </w:r>
@@ -2856,7 +2778,7 @@
       <w:rPr>
         <w:rFonts w:ascii="Calibri" w:hAnsi="Calibri" w:eastAsia="Calibri"/>
         <w:b/>
-        <w:color w:val="666666"/>
+        <w:color w:val="000000"/>
         <w:sz w:val="17"/>
       </w:rPr>
       <w:t>INTRODUCTION TO STATA · ECBS5241</w:t>
@@ -3335,7 +3257,7 @@
       <w:rFonts w:asciiTheme="majorHAnsi" w:eastAsiaTheme="majorEastAsia" w:hAnsiTheme="majorHAnsi" w:cstheme="majorBidi" w:ascii="Calibri" w:hAnsi="Calibri"/>
       <w:b/>
       <w:bCs/>
-      <w:color w:val="2E74B5"/>
+      <w:color w:val="000000"/>
       <w:sz w:val="32"/>
       <w:szCs w:val="28"/>
     </w:rPr>
@@ -3359,7 +3281,7 @@
       <w:rFonts w:asciiTheme="majorHAnsi" w:eastAsiaTheme="majorEastAsia" w:hAnsiTheme="majorHAnsi" w:cstheme="majorBidi" w:ascii="Calibri" w:hAnsi="Calibri"/>
       <w:b/>
       <w:bCs/>
-      <w:color w:val="2E74B5"/>
+      <w:color w:val="000000"/>
       <w:sz w:val="26"/>
       <w:szCs w:val="26"/>
     </w:rPr>
@@ -3615,15 +3537,12 @@
     <w:qFormat/>
     <w:rsid w:val="00FC693F"/>
     <w:pPr>
-      <w:pBdr>
-        <w:bottom w:val="single" w:sz="8" w:space="4" w:color="4F81BD" w:themeColor="accent1"/>
-      </w:pBdr>
       <w:spacing w:after="300" w:line="240" w:lineRule="auto"/>
       <w:contextualSpacing/>
     </w:pPr>
     <w:rPr>
       <w:rFonts w:asciiTheme="majorHAnsi" w:eastAsiaTheme="majorEastAsia" w:hAnsiTheme="majorHAnsi" w:cstheme="majorBidi"/>
-      <w:color w:val="17365D" w:themeColor="text2" w:themeShade="BF"/>
+      <w:color w:val="000000"/>
       <w:spacing w:val="5"/>
       <w:kern w:val="28"/>
       <w:sz w:val="52"/>

</xml_diff>

<commit_message>
Simplify final Stata lecture and shorten macro introduction
Separate data-free programming practice from basic line plots and scatterplots. Allocate eight minutes to locals, globals, and scope, with 40 minutes for programming and 30 for graphics. Simplify checkpoint 4 and exam scope, synchronize the schedule and syllabuses, and preserve instructor-only exclusions.
</commit_message>
<xml_diff>
--- a/Introduction-to-Stata-Syllabus.docx
+++ b/Introduction-to-Stata-Syllabus.docx
@@ -950,7 +950,7 @@
         <w:spacing w:before="0" w:after="160" w:line="280" w:lineRule="auto"/>
       </w:pPr>
       <w:r>
-        <w:t>Distinguish local and global macros, use locals with foreach and simple forvalues loops, and verify one iteration against manually written commands.</w:t>
+        <w:t>Define and reference local and global macros, explain their scope, and trace and adapt short foreach and forvalues loops, checking one pass manually.</w:t>
       </w:r>
     </w:p>
     <w:p>
@@ -962,7 +962,7 @@
         <w:spacing w:before="0" w:after="160" w:line="280" w:lineRule="auto"/>
       </w:pPr>
       <w:r>
-        <w:t>Create and interpret histograms, box plots, and scatterplots with a fitted line; label samples and units, export figures, and read descriptive and regression output.</w:t>
+        <w:t>Create basic line plots and scatterplots with a fitted line; use sort for line plots, label axes and units, export figures, and explain what is plotted.</w:t>
       </w:r>
     </w:p>
     <w:p>
@@ -987,7 +987,7 @@
         <w:widowControl/>
       </w:pPr>
       <w:r>
-        <w:t>Basic regression, programming foundations, and basic graphics are part of the core teaching and exam scope. Writing while loops, reshaping, custom programs, extended regression-cutoff analysis, additional table exports, adjusted predictions, and resampling are outside the exam scope. While is demonstrated for recognition only.</w:t>
+        <w:t>Basic regression, programming foundations, and basic graphics are part of the core teaching and exam scope. Histograms, box plots, while loops, nested loops, reshaping, custom programs, extended regression-cutoff analysis, additional table exports, adjusted predictions, and resampling are optional and outside the exam scope.</w:t>
       </w:r>
     </w:p>
     <w:p>
@@ -1040,12 +1040,7 @@
         <w:spacing w:before="0" w:after="160" w:line="280" w:lineRule="auto"/>
       </w:pPr>
       <w:r>
-        <w:rPr>
-          <w:rFonts w:ascii="Calibri" w:hAnsi="Calibri" w:eastAsia="Calibri"/>
-          <w:color w:val="0B2545"/>
-          <w:sz w:val="22"/>
-        </w:rPr>
-        <w:t>An annotated lecture do-file introduces the session's concepts.</w:t>
+        <w:t>Annotated do-files introduce the concepts. Lecture 5 starts with data-free programming practice, then opens a separate file for basic plots.</w:t>
       </w:r>
     </w:p>
     <w:p>
@@ -1057,12 +1052,7 @@
         <w:spacing w:before="0" w:after="160" w:line="280" w:lineRule="auto"/>
       </w:pPr>
       <w:r>
-        <w:rPr>
-          <w:rFonts w:ascii="Calibri" w:hAnsi="Calibri" w:eastAsia="Calibri"/>
-          <w:color w:val="0B2545"/>
-          <w:sz w:val="22"/>
-        </w:rPr>
-        <w:t>An exercise applies a variation of those concepts to real, anonymized hotel-price data.</w:t>
+        <w:t>An exercise practises the concepts using short programming tasks or real, anonymized hotel-price data, with data selection supplied in checkpoint 4.</w:t>
       </w:r>
     </w:p>
     <w:p>
@@ -1645,7 +1635,7 @@
         <w:widowControl/>
       </w:pPr>
       <w:r>
-        <w:t>The individual final exam takes place during Session 6 on Monday, 19 October 2026, 08:50–10:30. This is the original scheduled exam slot and is unchanged. It assesses the Stata concepts and reproducible workflow taught in the five teaching meetings, including basic graphics: histograms, box plots, scatterplots with a fitted line, labels, sample restrictions, interpretation, and PNG export. There is no new lecture or separate checkpoint in this meeting.</w:t>
+        <w:t>The individual final exam takes place during Session 6 on Monday, 19 October 2026, 08:50–10:30. This is the original scheduled exam slot and is unchanged. It assesses the Stata concepts and reproducible workflow taught in the five teaching meetings, including basic graphics: line plots with sort, scatterplots with a fitted line, titles, axis labels and units, reading the plotted sample, and PNG export. There is no new lecture or separate checkpoint in this meeting.</w:t>
       </w:r>
     </w:p>
     <w:p>
@@ -1754,7 +1744,7 @@
         <w:widowControl/>
       </w:pPr>
       <w:r>
-        <w:t xml:space="preserve">Lectures 1 and 2 and their exercises remain unchanged. The revised sequence keeps three separate lecture files: </w:t>
+        <w:t xml:space="preserve">Lectures 1 and 2 and their exercises remain unchanged. The revised sequence keeps three separate lecture modules: </w:t>
       </w:r>
       <w:r>
         <w:rPr>
@@ -2233,12 +2223,7 @@
         <w:spacing w:before="0" w:after="160" w:line="280" w:lineRule="auto"/>
       </w:pPr>
       <w:r>
-        <w:rPr>
-          <w:rFonts w:ascii="Calibri" w:hAnsi="Calibri" w:eastAsia="Calibri"/>
-          <w:color w:val="0B2545"/>
-          <w:sz w:val="22"/>
-        </w:rPr>
-        <w:t>Taught on 12 October, after students have learned to run regressions manually.</w:t>
+        <w:t>Taught on 12 October, the final teaching meeting before the exam.</w:t>
       </w:r>
     </w:p>
     <w:p>
@@ -2250,7 +2235,16 @@
         <w:spacing w:before="0" w:after="160" w:line="280" w:lineRule="auto"/>
       </w:pPr>
       <w:r>
-        <w:t>Explain macros, text substitution, expressions, local scope, and global scope.</w:t>
+        <w:t xml:space="preserve">Start with </w:t>
+      </w:r>
+      <w:r>
+        <w:rPr>
+          <w:rFonts w:ascii="Consolas" w:hAnsi="Consolas"/>
+        </w:rPr>
+        <w:t>lecture.do</w:t>
+      </w:r>
+      <w:r>
+        <w:t>: data-free examples of locals, globals, substitution, quotes, scope, and loop syntax. Spend 40 minutes on programming practice.</w:t>
       </w:r>
     </w:p>
     <w:p>
@@ -2262,7 +2256,7 @@
         <w:spacing w:before="0" w:after="160" w:line="280" w:lineRule="auto"/>
       </w:pPr>
       <w:r>
-        <w:t xml:space="preserve">Practise </w:t>
+        <w:t xml:space="preserve">Trace </w:t>
       </w:r>
       <w:r>
         <w:rPr>
@@ -2280,16 +2274,7 @@
         <w:t>forvalues</w:t>
       </w:r>
       <w:r>
-        <w:t xml:space="preserve"> loops; briefly demonstrate </w:t>
-      </w:r>
-      <w:r>
-        <w:rPr>
-          <w:rFonts w:ascii="Consolas" w:hAnsi="Consolas"/>
-        </w:rPr>
-        <w:t>while</w:t>
-      </w:r>
-      <w:r>
-        <w:t>.</w:t>
+        <w:t xml:space="preserve"> loops one pass at a time; predict output, change the list or repeated command, and check a pass manually.</w:t>
       </w:r>
     </w:p>
     <w:p>
@@ -2301,7 +2286,16 @@
         <w:spacing w:before="0" w:after="160" w:line="280" w:lineRule="auto"/>
       </w:pPr>
       <w:r>
-        <w:t>Build histograms, box plots, and scatterplots with a fitted line; explain samples, units, bin widths, distributions, and associations.</w:t>
+        <w:t xml:space="preserve">Then use </w:t>
+      </w:r>
+      <w:r>
+        <w:rPr>
+          <w:rFonts w:ascii="Consolas" w:hAnsi="Consolas"/>
+        </w:rPr>
+        <w:t>graphics.do</w:t>
+      </w:r>
+      <w:r>
+        <w:t xml:space="preserve"> for 30 minutes: basic line plots, scatterplots, and a fitted line. Practise x/y order, sort, titles, axis labels, and PNG export.</w:t>
       </w:r>
     </w:p>
     <w:p>
@@ -2313,7 +2307,7 @@
         <w:spacing w:before="0" w:after="160" w:line="280" w:lineRule="auto"/>
       </w:pPr>
       <w:r>
-        <w:t>Use a city loop to label and export figures, then check one result manually.</w:t>
+        <w:t>Use short graphics exercises to change titles, axis variables, and plot layers.</w:t>
       </w:r>
     </w:p>
     <w:p>
@@ -2325,16 +2319,7 @@
         <w:spacing w:before="0" w:after="160" w:line="280" w:lineRule="auto"/>
       </w:pPr>
       <w:r>
-        <w:t xml:space="preserve">Checkpoint 4 (10%): use locals and </w:t>
-      </w:r>
-      <w:r>
-        <w:rPr>
-          <w:rFonts w:ascii="Consolas" w:hAnsi="Consolas"/>
-        </w:rPr>
-        <w:t>foreach</w:t>
-      </w:r>
-      <w:r>
-        <w:t xml:space="preserve"> to make guest-rating histograms for Budapest and Zagreb, verify Budapest manually, and interpret the graphs. Submit a do-file, log, and two city-specific PNGs. Allow 25 minutes.</w:t>
+        <w:t>Checkpoint 4 (10%): define macros, explain scope, trace a foreach loop, predict a forvalues loop, and make one labelled line plot from supplied hotel data. Submit a do-file, log, and one PNG. Allow 25 minutes, then five minutes for recap.</w:t>
       </w:r>
     </w:p>
     <w:p>
@@ -2461,7 +2446,7 @@
         <w:t>Monday, 19 October 2026, 08:50–10:30</w:t>
       </w:r>
       <w:r>
-        <w:t>, worth 60%. It covers the core material actually taught in the five teaching meetings, including regression, local macros, the local/global distinction, foreach and simple forvalues loops, and basic graphics. There is no new lecture or checkpoint in the exam meeting. Detailed instructions will be provided separately.</w:t>
+        <w:t>, worth 60%. It covers the core material actually taught in the five teaching meetings, including regression, local and global macros, scope, foreach and simple forvalues loops, and basic line plots and scatterplots. There is no new lecture or checkpoint in the exam meeting. Detailed instructions will be provided separately.</w:t>
       </w:r>
     </w:p>
     <w:p>
@@ -2483,7 +2468,7 @@
         <w:widowControl/>
       </w:pPr>
       <w:r>
-        <w:t xml:space="preserve">Reshaping, custom programs, extended regression-cutoff analysis, additional table exports, adjusted predictions, residual diagnostics, and resampling remain optional, ungraded reference. Optional files add no exam requirements; basic graph types taught in Lecture 5 remain required even if optional files also use them. Writing while loops is not required. Optional files are named in the lecture guides. The </w:t>
+        <w:t xml:space="preserve">Histograms, box plots, while loops, nested loops, reshaping, custom programs, extended regression-cutoff analysis, additional table exports, adjusted predictions, residual diagnostics, and resampling remain optional, ungraded reference and add no exam requirements. The basic line-plot and scatterplot skills in Lecture 5's graphics.do remain required. Optional files are named in the lecture guides. The </w:t>
       </w:r>
       <w:r>
         <w:rPr>

</xml_diff>

<commit_message>
Rename programming and graphics module and simplify checkpoint practice
</commit_message>
<xml_diff>
--- a/Introduction-to-Stata-Syllabus.docx
+++ b/Introduction-to-Stata-Syllabus.docx
@@ -2319,7 +2319,7 @@
         <w:spacing w:before="0" w:after="160" w:line="280" w:lineRule="auto"/>
       </w:pPr>
       <w:r>
-        <w:t>Checkpoint 4 (10%): define macros, explain scope, trace a foreach loop, predict a forvalues loop, and make one labelled line plot from supplied hotel data. Submit a do-file, log, and one PNG. Allow 25 minutes, then five minutes for recap.</w:t>
+        <w:t>Checkpoint 4 (10%): define macros, explain scope, trace a foreach loop, predict a forvalues loop, and make a labelled line plot and scatterplot from supplied hotel data. Adding a fitted line is optional for this checkpoint. Submit a do-file, log, and two PNGs. Allow 25 minutes, then five minutes for recap.</w:t>
       </w:r>
     </w:p>
     <w:p>
@@ -2344,7 +2344,7 @@
           <w:color w:val="1F4D78"/>
           <w:sz w:val="19"/>
         </w:rPr>
-        <w:t>session-05-descriptives-graphics</w:t>
+        <w:t>session-05-programming-graphics</w:t>
       </w:r>
       <w:r>
         <w:rPr>
@@ -2352,7 +2352,7 @@
           <w:color w:val="0B2545"/>
           <w:sz w:val="22"/>
         </w:rPr>
-        <w:t>; the folder name is retained for links.</w:t>
+        <w:t>.</w:t>
       </w:r>
     </w:p>
     <w:p>

</xml_diff>